<commit_message>
Update student identity details in HelpDesk_Assignment_Submission Word documents
</commit_message>
<xml_diff>
--- a/Assignment July 20/StudentRegistration_Assignment_Submission.docx
+++ b/Assignment July 20/StudentRegistration_Assignment_Submission.docx
@@ -23,7 +23,7 @@
           <w:u w:val="single"/>
           <w:lang w:val="en-IN"/>
         </w:rPr>
-        <w:t>IN26012154</w:t>
+        <w:t>IN26012152</w:t>
       </w:r>
     </w:p>
     <w:p>
@@ -203,7 +203,7 @@
           <w:szCs w:val="28"/>
           <w:lang w:val="en-IN"/>
         </w:rPr>
-        <w:t>Name: Akhil Astitva</w:t>
+        <w:t>Name: Shri Ram Prince Mishra</w:t>
       </w:r>
     </w:p>
     <w:p>
@@ -227,7 +227,7 @@
           <w:szCs w:val="28"/>
           <w:lang w:val="en-IN"/>
         </w:rPr>
-        <w:t>Application No.: IN26012154</w:t>
+        <w:t>Application No.: IN26012152</w:t>
       </w:r>
     </w:p>
     <w:p>
@@ -17097,6 +17097,7 @@
     <w:p/>
     <w:sectPr>
       <w:headerReference w:type="default" r:id="rId14"/>
+      <w:footerReference w:type="default" r:id="rId17"/>
       <w:pgSz w:w="12240" w:h="15840"/>
       <w:pgMar w:top="1152" w:right="1152" w:bottom="1152" w:left="1152" w:header="720" w:footer="720" w:gutter="0"/>
       <w:cols w:space="720"/>
@@ -17131,6 +17132,16 @@
 </w:endnotes>
 </file>
 
+<file path=word/footer1.xml><?xml version="1.0" encoding="utf-8"?>
+<w:ftr xmlns:m="http://schemas.openxmlformats.org/officeDocument/2006/math" xmlns:mc="http://schemas.openxmlformats.org/markup-compatibility/2006" xmlns:mo="http://schemas.microsoft.com/office/mac/office/2008/main" xmlns:mv="urn:schemas-microsoft-com:mac:vml" xmlns:o="urn:schemas-microsoft-com:office:office" xmlns:r="http://schemas.openxmlformats.org/officeDocument/2006/relationships" xmlns:v="urn:schemas-microsoft-com:vml" xmlns:w10="urn:schemas-microsoft-com:office:word" xmlns:w14="http://schemas.microsoft.com/office/word/2010/wordml" xmlns:w="http://schemas.openxmlformats.org/wordprocessingml/2006/main" xmlns:wne="http://schemas.microsoft.com/office/word/2006/wordml" xmlns:wp14="http://schemas.microsoft.com/office/word/2010/wordprocessingDrawing" xmlns:wp="http://schemas.openxmlformats.org/drawingml/2006/wordprocessingDrawing" xmlns:wpc="http://schemas.microsoft.com/office/word/2010/wordprocessingCanvas" xmlns:wpg="http://schemas.microsoft.com/office/word/2010/wordprocessingGroup" xmlns:wpi="http://schemas.microsoft.com/office/word/2010/wordprocessingInk" xmlns:wps="http://schemas.microsoft.com/office/word/2010/wordprocessingShape" mc:Ignorable="w14 wp14">
+  <w:p>
+    <w:pPr>
+      <w:pStyle w:val="Footer"/>
+    </w:pPr>
+  </w:p>
+</w:ftr>
+</file>
+
 <file path=word/footnotes.xml><?xml version="1.0" encoding="utf-8"?>
 <w:footnotes xmlns:wpc="http://schemas.microsoft.com/office/word/2010/wordprocessingCanvas" xmlns:cx="http://schemas.microsoft.com/office/drawing/2014/chartex" xmlns:cx1="http://schemas.microsoft.com/office/drawing/2015/9/8/chartex" xmlns:cx2="http://schemas.microsoft.com/office/drawing/2015/10/21/chartex" xmlns:cx3="http://schemas.microsoft.com/office/drawing/2016/5/9/chartex" xmlns:cx4="http://schemas.microsoft.com/office/drawing/2016/5/10/chartex" xmlns:cx5="http://schemas.microsoft.com/office/drawing/2016/5/11/chartex" xmlns:cx6="http://schemas.microsoft.com/office/drawing/2016/5/12/chartex" xmlns:cx7="http://schemas.microsoft.com/office/drawing/2016/5/13/chartex" xmlns:cx8="http://schemas.microsoft.com/office/drawing/2016/5/14/chartex" xmlns:mc="http://schemas.openxmlformats.org/markup-compatibility/2006" xmlns:aink="http://schemas.microsoft.com/office/drawing/2016/ink" xmlns:am3d="http://schemas.microsoft.com/office/drawing/2017/model3d" xmlns:o="urn:schemas-microsoft-com:office:office" xmlns:oel="http://schemas.microsoft.com/office/2019/extlst" xmlns:r="http://schemas.openxmlformats.org/officeDocument/2006/relationships" xmlns:m="http://schemas.openxmlformats.org/officeDocument/2006/math" xmlns:v="urn:schemas-microsoft-com:vml" xmlns:wp14="http://schemas.microsoft.com/office/word/2010/wordprocessingDrawing" xmlns:wp="http://schemas.openxmlformats.org/drawingml/2006/wordprocessingDrawing" xmlns:w10="urn:schemas-microsoft-com:office:word" xmlns:w="http://schemas.openxmlformats.org/wordprocessingml/2006/main" xmlns:w14="http://schemas.microsoft.com/office/word/2010/wordml" xmlns:w15="http://schemas.microsoft.com/office/word/2012/wordml" xmlns:w16cex="http://schemas.microsoft.com/office/word/2018/wordml/cex" xmlns:w16cid="http://schemas.microsoft.com/office/word/2016/wordml/cid" xmlns:w16="http://schemas.microsoft.com/office/word/2018/wordml" xmlns:w16du="http://schemas.microsoft.com/office/word/2023/wordml/word16du" xmlns:w16sdtdh="http://schemas.microsoft.com/office/word/2020/wordml/sdtdatahash" xmlns:w16sdtfl="http://schemas.microsoft.com/office/word/2024/wordml/sdtformatlock" xmlns:w16se="http://schemas.microsoft.com/office/word/2015/wordml/symex" xmlns:wpg="http://schemas.microsoft.com/office/word/2010/wordprocessingGroup" xmlns:wpi="http://schemas.microsoft.com/office/word/2010/wordprocessingInk" xmlns:wne="http://schemas.microsoft.com/office/word/2006/wordml" xmlns:wps="http://schemas.microsoft.com/office/word/2010/wordprocessingShape" mc:Ignorable="w14 w15 w16se w16cid w16 w16cex w16sdtdh w16sdtfl w16du wp14">
   <w:footnote w:type="separator" w:id="-1">
@@ -17163,7 +17174,7 @@
       <w:pStyle w:val="Header"/>
     </w:pPr>
     <w:r>
-      <w:t>Akhil Astitva</w:t>
+      <w:t>Shri Ram Prince Mishra</w:t>
     </w:r>
   </w:p>
 </w:hdr>

</xml_diff>